<commit_message>
Manuales de flujo con capturas (Comercial, Activos, Inventario) y manuales EP actualizados a v2.0
Co-Authored-By: Claude Sonnet 5.5 <noreply@anthropic.com>
</commit_message>
<xml_diff>
--- a/Fase 2/Evidencias Proyecto/Manuales/SIGMA_Manual_EP02_Estructura_organizacional.docx
+++ b/Fase 2/Evidencias Proyecto/Manuales/SIGMA_Manual_EP02_Estructura_organizacional.docx
@@ -211,12 +211,13 @@
             <w:tcW w:type="dxa" w:w="6803"/>
           </w:tcPr>
           <w:p>
-            <w:r/>
+            <w:r>
+              <w:t>2.0 · 16-10-2026</w:t>
+            </w:r>
             <w:r>
               <w:rPr>
                 <w:sz w:val="20"/>
               </w:rPr>
-              <w:t>1.1 · 02-10-2026</w:t>
             </w:r>
           </w:p>
         </w:tc>
@@ -226,6 +227,203 @@
       <w:pPr>
         <w:spacing w:after="40"/>
       </w:pPr>
+    </w:p>
+    <w:p>
+      <w:pPr>
+        <w:pStyle w:val="Heading1"/>
+      </w:pPr>
+      <w:r>
+        <w:t>Novedades de la versión 2.0 · 16-10-2026</w:t>
+      </w:r>
+    </w:p>
+    <w:p>
+      <w:pPr/>
+      <w:r>
+        <w:t>Este manual se revisó contra la pantalla real. Lo que cambió desde la versión 1.1:</w:t>
+      </w:r>
+    </w:p>
+    <w:p>
+      <w:pPr/>
+      <w:r>
+        <w:t xml:space="preserve">•  Las </w:t>
+      </w:r>
+      <w:r>
+        <w:rPr>
+          <w:b/>
+        </w:rPr>
+        <w:t>plantas</w:t>
+      </w:r>
+      <w:r>
+        <w:t xml:space="preserve"> y las </w:t>
+      </w:r>
+      <w:r>
+        <w:rPr>
+          <w:b/>
+        </w:rPr>
+        <w:t>áreas</w:t>
+      </w:r>
+      <w:r>
+        <w:t xml:space="preserve"> se administran en </w:t>
+      </w:r>
+      <w:r>
+        <w:rPr>
+          <w:b/>
+        </w:rPr>
+        <w:t>Cliente › Organización</w:t>
+      </w:r>
+      <w:r>
+        <w:t xml:space="preserve">; el código de área es único </w:t>
+      </w:r>
+      <w:r>
+        <w:rPr>
+          <w:b/>
+        </w:rPr>
+        <w:t>dentro de la planta</w:t>
+      </w:r>
+      <w:r>
+        <w:t xml:space="preserve"> y las áreas forman un </w:t>
+      </w:r>
+      <w:r>
+        <w:rPr>
+          <w:b/>
+        </w:rPr>
+        <w:t>árbol</w:t>
+      </w:r>
+      <w:r>
+        <w:t xml:space="preserve"> (una línea cuelga de un área mayor).</w:t>
+      </w:r>
+    </w:p>
+    <w:p>
+      <w:pPr/>
+      <w:r>
+        <w:t xml:space="preserve">•  En las cargas desde Excel conviene escribir el </w:t>
+      </w:r>
+      <w:r>
+        <w:rPr>
+          <w:b/>
+        </w:rPr>
+        <w:t>código del área</w:t>
+      </w:r>
+      <w:r>
+        <w:t xml:space="preserve"> (</w:t>
+      </w:r>
+      <w:r>
+        <w:rPr>
+          <w:rFonts w:ascii="Consolas" w:hAnsi="Consolas"/>
+        </w:rPr>
+        <w:t>PAN-L2</w:t>
+      </w:r>
+      <w:r>
+        <w:t>) y no su nombre, porque hay áreas con el mismo nombre en distintas líneas.</w:t>
+      </w:r>
+    </w:p>
+    <w:p>
+      <w:pPr/>
+      <w:r>
+        <w:t xml:space="preserve">•  Los </w:t>
+      </w:r>
+      <w:r>
+        <w:rPr>
+          <w:b/>
+        </w:rPr>
+        <w:t>centros de costo</w:t>
+      </w:r>
+      <w:r>
+        <w:t xml:space="preserve">, </w:t>
+      </w:r>
+      <w:r>
+        <w:rPr>
+          <w:b/>
+        </w:rPr>
+        <w:t>grupos de trabajo</w:t>
+      </w:r>
+      <w:r>
+        <w:t xml:space="preserve">, </w:t>
+      </w:r>
+      <w:r>
+        <w:rPr>
+          <w:b/>
+        </w:rPr>
+        <w:t>perfiles</w:t>
+      </w:r>
+      <w:r>
+        <w:t xml:space="preserve">, </w:t>
+      </w:r>
+      <w:r>
+        <w:rPr>
+          <w:b/>
+        </w:rPr>
+        <w:t>usuarios</w:t>
+      </w:r>
+      <w:r>
+        <w:t xml:space="preserve"> y </w:t>
+      </w:r>
+      <w:r>
+        <w:rPr>
+          <w:b/>
+        </w:rPr>
+        <w:t>permisos</w:t>
+      </w:r>
+      <w:r>
+        <w:t xml:space="preserve"> se encuentran bajo </w:t>
+      </w:r>
+      <w:r>
+        <w:rPr>
+          <w:b/>
+        </w:rPr>
+        <w:t>Cliente › Usuarios</w:t>
+      </w:r>
+      <w:r>
+        <w:t xml:space="preserve"> y </w:t>
+      </w:r>
+      <w:r>
+        <w:rPr>
+          <w:b/>
+        </w:rPr>
+        <w:t>Cliente › Organización</w:t>
+      </w:r>
+      <w:r>
+        <w:t>.</w:t>
+      </w:r>
+    </w:p>
+    <w:p>
+      <w:pPr/>
+      <w:r>
+        <w:rPr>
+          <w:b/>
+        </w:rPr>
+        <w:t>Recorrido paso a paso con capturas de pantalla:</w:t>
+      </w:r>
+      <w:r>
+        <w:t xml:space="preserve"> ver </w:t>
+      </w:r>
+      <w:r>
+        <w:rPr>
+          <w:rFonts w:ascii="Consolas" w:hAnsi="Consolas"/>
+        </w:rPr>
+        <w:t>SIGMA_Flujo_Activos.docx (sección 3: «La estructura: plantas y áreas»)</w:t>
+      </w:r>
+      <w:r>
+        <w:t xml:space="preserve"> en la carpeta </w:t>
+      </w:r>
+      <w:r>
+        <w:rPr>
+          <w:rFonts w:ascii="Consolas" w:hAnsi="Consolas"/>
+        </w:rPr>
+        <w:t>Manuales/Flujos</w:t>
+      </w:r>
+      <w:r>
+        <w:t xml:space="preserve">. Si una pantalla difiere de lo descrito en la sección 3, </w:t>
+      </w:r>
+      <w:r>
+        <w:rPr>
+          <w:b/>
+        </w:rPr>
+        <w:t>prevalece el manual de flujo</w:t>
+      </w:r>
+      <w:r>
+        <w:t>.</w:t>
+      </w:r>
     </w:p>
     <w:p>
       <w:pPr>
@@ -553,7 +751,7 @@
           <w:i w:val="0"/>
           <w:sz w:val="22"/>
         </w:rPr>
-        <w:t>Estas son las pantallas que usa el módulo, con la ruta exacta del menú lateral:</w:t>
+        <w:t>Rutas actualizadas al 16-10-2026, tal como están hoy en el menú lateral y en el Centro correspondiente:</w:t>
       </w:r>
     </w:p>
     <w:tbl>
@@ -582,13 +780,14 @@
             <w:shd w:val="clear" w:color="auto" w:fill="E8E5F7"/>
           </w:tcPr>
           <w:p>
-            <w:r/>
+            <w:r>
+              <w:t>Pantalla</w:t>
+            </w:r>
             <w:r>
               <w:rPr>
                 <w:b/>
                 <w:sz w:val="19"/>
               </w:rPr>
-              <w:t>Pantalla</w:t>
             </w:r>
           </w:p>
         </w:tc>
@@ -598,13 +797,14 @@
             <w:shd w:val="clear" w:color="auto" w:fill="E8E5F7"/>
           </w:tcPr>
           <w:p>
-            <w:r/>
+            <w:r>
+              <w:t>Dónde está (menú lateral)</w:t>
+            </w:r>
             <w:r>
               <w:rPr>
                 <w:b/>
                 <w:sz w:val="19"/>
               </w:rPr>
-              <w:t>Ruta en el menú</w:t>
             </w:r>
           </w:p>
         </w:tc>
@@ -614,13 +814,14 @@
             <w:shd w:val="clear" w:color="auto" w:fill="E8E5F7"/>
           </w:tcPr>
           <w:p>
-            <w:r/>
+            <w:r>
+              <w:t>Qué trae</w:t>
+            </w:r>
             <w:r>
               <w:rPr>
                 <w:b/>
                 <w:sz w:val="19"/>
               </w:rPr>
-              <w:t>Pestañas que tiene</w:t>
             </w:r>
           </w:p>
         </w:tc>
@@ -631,12 +832,13 @@
             <w:tcW w:type="dxa" w:w="2551"/>
           </w:tcPr>
           <w:p>
-            <w:r/>
+            <w:r>
+              <w:t>Identidad del cliente</w:t>
+            </w:r>
             <w:r>
               <w:rPr>
                 <w:sz w:val="19"/>
               </w:rPr>
-              <w:t>Clientes</w:t>
             </w:r>
           </w:p>
         </w:tc>
@@ -645,12 +847,13 @@
             <w:tcW w:type="dxa" w:w="3969"/>
           </w:tcPr>
           <w:p>
-            <w:r/>
+            <w:r>
+              <w:t>Cliente › Identidad</w:t>
+            </w:r>
             <w:r>
               <w:rPr>
                 <w:sz w:val="19"/>
               </w:rPr>
-              <w:t>Comercial › Clientes</w:t>
             </w:r>
           </w:p>
         </w:tc>
@@ -659,12 +862,13 @@
             <w:tcW w:type="dxa" w:w="3118"/>
           </w:tcPr>
           <w:p>
-            <w:r/>
+            <w:r>
+              <w:t>Datos de la empresa</w:t>
+            </w:r>
             <w:r>
               <w:rPr>
                 <w:sz w:val="19"/>
               </w:rPr>
-              <w:t>—</w:t>
             </w:r>
           </w:p>
         </w:tc>
@@ -675,12 +879,13 @@
             <w:tcW w:type="dxa" w:w="2551"/>
           </w:tcPr>
           <w:p>
-            <w:r/>
+            <w:r>
+              <w:t>Perfiles · Usuarios · Permisos · Especialidades · Grupos</w:t>
+            </w:r>
             <w:r>
               <w:rPr>
                 <w:sz w:val="19"/>
               </w:rPr>
-              <w:t>Usuarios</w:t>
             </w:r>
           </w:p>
         </w:tc>
@@ -689,12 +894,13 @@
             <w:tcW w:type="dxa" w:w="3969"/>
           </w:tcPr>
           <w:p>
-            <w:r/>
+            <w:r>
+              <w:t>Cliente › Usuarios › …</w:t>
+            </w:r>
             <w:r>
               <w:rPr>
                 <w:sz w:val="19"/>
               </w:rPr>
-              <w:t>Cliente › Usuarios › Usuarios</w:t>
             </w:r>
           </w:p>
         </w:tc>
@@ -703,12 +909,13 @@
             <w:tcW w:type="dxa" w:w="3118"/>
           </w:tcPr>
           <w:p>
-            <w:r/>
+            <w:r>
+              <w:t>Personas, perfiles, permisos puntuales, certificaciones y grupos de trabajo</w:t>
+            </w:r>
             <w:r>
               <w:rPr>
                 <w:sz w:val="19"/>
               </w:rPr>
-              <w:t>—</w:t>
             </w:r>
           </w:p>
         </w:tc>
@@ -719,12 +926,13 @@
             <w:tcW w:type="dxa" w:w="2551"/>
           </w:tcPr>
           <w:p>
-            <w:r/>
+            <w:r>
+              <w:t>Plantas</w:t>
+            </w:r>
             <w:r>
               <w:rPr>
                 <w:sz w:val="19"/>
               </w:rPr>
-              <w:t>Perfiles</w:t>
             </w:r>
           </w:p>
         </w:tc>
@@ -733,12 +941,13 @@
             <w:tcW w:type="dxa" w:w="3969"/>
           </w:tcPr>
           <w:p>
-            <w:r/>
+            <w:r>
+              <w:t>Cliente › Organización › Plantas</w:t>
+            </w:r>
             <w:r>
               <w:rPr>
                 <w:sz w:val="19"/>
               </w:rPr>
-              <w:t>Sistema › Acceso › Perfiles</w:t>
             </w:r>
           </w:p>
         </w:tc>
@@ -747,12 +956,13 @@
             <w:tcW w:type="dxa" w:w="3118"/>
           </w:tcPr>
           <w:p>
-            <w:r/>
+            <w:r>
+              <w:t>Lista y ficha «Nueva planta» (coordenadas automáticas por dirección, zona horaria propia)</w:t>
+            </w:r>
             <w:r>
               <w:rPr>
                 <w:sz w:val="19"/>
               </w:rPr>
-              <w:t>—</w:t>
             </w:r>
           </w:p>
         </w:tc>
@@ -763,12 +973,13 @@
             <w:tcW w:type="dxa" w:w="2551"/>
           </w:tcPr>
           <w:p>
-            <w:r/>
+            <w:r>
+              <w:t>Áreas</w:t>
+            </w:r>
             <w:r>
               <w:rPr>
                 <w:sz w:val="19"/>
               </w:rPr>
-              <w:t>Plantas</w:t>
             </w:r>
           </w:p>
         </w:tc>
@@ -777,12 +988,13 @@
             <w:tcW w:type="dxa" w:w="3969"/>
           </w:tcPr>
           <w:p>
-            <w:r/>
+            <w:r>
+              <w:t>Cliente › Organización › Áreas</w:t>
+            </w:r>
             <w:r>
               <w:rPr>
                 <w:sz w:val="19"/>
               </w:rPr>
-              <w:t>Cliente › Organización › Plantas</w:t>
             </w:r>
           </w:p>
         </w:tc>
@@ -791,12 +1003,13 @@
             <w:tcW w:type="dxa" w:w="3118"/>
           </w:tcPr>
           <w:p>
-            <w:r/>
+            <w:r>
+              <w:t>Árbol de áreas con «Nueva área», «Desplegar todo» y «Plegar todo»</w:t>
+            </w:r>
             <w:r>
               <w:rPr>
                 <w:sz w:val="19"/>
               </w:rPr>
-              <w:t>—</w:t>
             </w:r>
           </w:p>
         </w:tc>
@@ -807,12 +1020,13 @@
             <w:tcW w:type="dxa" w:w="2551"/>
           </w:tcPr>
           <w:p>
-            <w:r/>
+            <w:r>
+              <w:t>Centros de costo</w:t>
+            </w:r>
             <w:r>
               <w:rPr>
                 <w:sz w:val="19"/>
               </w:rPr>
-              <w:t>Áreas</w:t>
             </w:r>
           </w:p>
         </w:tc>
@@ -821,12 +1035,13 @@
             <w:tcW w:type="dxa" w:w="3969"/>
           </w:tcPr>
           <w:p>
-            <w:r/>
+            <w:r>
+              <w:t>Cliente › Organización › Centros de costo</w:t>
+            </w:r>
             <w:r>
               <w:rPr>
                 <w:sz w:val="19"/>
               </w:rPr>
-              <w:t>Cliente › Organización › Áreas</w:t>
             </w:r>
           </w:p>
         </w:tc>
@@ -835,12 +1050,13 @@
             <w:tcW w:type="dxa" w:w="3118"/>
           </w:tcPr>
           <w:p>
-            <w:r/>
+            <w:r>
+              <w:t>Lista y ficha</w:t>
+            </w:r>
             <w:r>
               <w:rPr>
                 <w:sz w:val="19"/>
               </w:rPr>
-              <w:t>—</w:t>
             </w:r>
           </w:p>
         </w:tc>
@@ -851,12 +1067,13 @@
             <w:tcW w:type="dxa" w:w="2551"/>
           </w:tcPr>
           <w:p>
-            <w:r/>
+            <w:r>
+              <w:t>Catálogos</w:t>
+            </w:r>
             <w:r>
               <w:rPr>
                 <w:sz w:val="19"/>
               </w:rPr>
-              <w:t>Especialidades</w:t>
             </w:r>
           </w:p>
         </w:tc>
@@ -865,12 +1082,13 @@
             <w:tcW w:type="dxa" w:w="3969"/>
           </w:tcPr>
           <w:p>
-            <w:r/>
+            <w:r>
+              <w:t>Cliente › Configuración › Catálogos</w:t>
+            </w:r>
             <w:r>
               <w:rPr>
                 <w:sz w:val="19"/>
               </w:rPr>
-              <w:t>Cliente › Usuarios › Especialidades</w:t>
             </w:r>
           </w:p>
         </w:tc>
@@ -879,100 +1097,13 @@
             <w:tcW w:type="dxa" w:w="3118"/>
           </w:tcPr>
           <w:p>
-            <w:r/>
+            <w:r>
+              <w:t>Valores propios de los catálogos ampliables</w:t>
+            </w:r>
             <w:r>
               <w:rPr>
                 <w:sz w:val="19"/>
               </w:rPr>
-              <w:t>—</w:t>
-            </w:r>
-          </w:p>
-        </w:tc>
-      </w:tr>
-      <w:tr>
-        <w:tc>
-          <w:tcPr>
-            <w:tcW w:type="dxa" w:w="2551"/>
-          </w:tcPr>
-          <w:p>
-            <w:r/>
-            <w:r>
-              <w:rPr>
-                <w:sz w:val="19"/>
-              </w:rPr>
-              <w:t>Centros de costo</w:t>
-            </w:r>
-          </w:p>
-        </w:tc>
-        <w:tc>
-          <w:tcPr>
-            <w:tcW w:type="dxa" w:w="3969"/>
-          </w:tcPr>
-          <w:p>
-            <w:r/>
-            <w:r>
-              <w:rPr>
-                <w:sz w:val="19"/>
-              </w:rPr>
-              <w:t>Cliente › Organización › Centros de costo</w:t>
-            </w:r>
-          </w:p>
-        </w:tc>
-        <w:tc>
-          <w:tcPr>
-            <w:tcW w:type="dxa" w:w="3118"/>
-          </w:tcPr>
-          <w:p>
-            <w:r/>
-            <w:r>
-              <w:rPr>
-                <w:sz w:val="19"/>
-              </w:rPr>
-              <w:t>—</w:t>
-            </w:r>
-          </w:p>
-        </w:tc>
-      </w:tr>
-      <w:tr>
-        <w:tc>
-          <w:tcPr>
-            <w:tcW w:type="dxa" w:w="2551"/>
-          </w:tcPr>
-          <w:p>
-            <w:r/>
-            <w:r>
-              <w:rPr>
-                <w:sz w:val="19"/>
-              </w:rPr>
-              <w:t>Grupos</w:t>
-            </w:r>
-          </w:p>
-        </w:tc>
-        <w:tc>
-          <w:tcPr>
-            <w:tcW w:type="dxa" w:w="3969"/>
-          </w:tcPr>
-          <w:p>
-            <w:r/>
-            <w:r>
-              <w:rPr>
-                <w:sz w:val="19"/>
-              </w:rPr>
-              <w:t>Cliente › Usuarios › Grupos</w:t>
-            </w:r>
-          </w:p>
-        </w:tc>
-        <w:tc>
-          <w:tcPr>
-            <w:tcW w:type="dxa" w:w="3118"/>
-          </w:tcPr>
-          <w:p>
-            <w:r/>
-            <w:r>
-              <w:rPr>
-                <w:sz w:val="19"/>
-              </w:rPr>
-              <w:t>—</w:t>
             </w:r>
           </w:p>
         </w:tc>
@@ -983,442 +1114,6 @@
         <w:spacing w:after="40"/>
       </w:pPr>
     </w:p>
-    <w:p>
-      <w:pPr>
-        <w:spacing w:after="80"/>
-      </w:pPr>
-      <w:r>
-        <w:rPr>
-          <w:b w:val="0"/>
-          <w:i w:val="0"/>
-          <w:color w:val="555555"/>
-          <w:sz w:val="20"/>
-        </w:rPr>
-        <w:t>Estas otras no están en el menú: se abren desde las anteriores, al pulsar un botón o al elegir una fila.</w:t>
-      </w:r>
-    </w:p>
-    <w:tbl>
-      <w:tblPr>
-        <w:tblW w:type="auto" w:w="0"/>
-        <w:tblLook w:firstColumn="1" w:firstRow="1" w:lastColumn="0" w:lastRow="0" w:noHBand="0" w:noVBand="1" w:val="04A0"/>
-        <w:jc w:val="center"/>
-        <w:tblBorders>
-          <w:top w:val="single" w:sz="4" w:color="BFBFBF"/>
-          <w:left w:val="single" w:sz="4" w:color="BFBFBF"/>
-          <w:bottom w:val="single" w:sz="4" w:color="BFBFBF"/>
-          <w:right w:val="single" w:sz="4" w:color="BFBFBF"/>
-          <w:insideH w:val="single" w:sz="4" w:color="BFBFBF"/>
-          <w:insideV w:val="single" w:sz="4" w:color="BFBFBF"/>
-        </w:tblBorders>
-      </w:tblPr>
-      <w:tblGrid>
-        <w:gridCol w:w="3249"/>
-        <w:gridCol w:w="3249"/>
-        <w:gridCol w:w="3249"/>
-      </w:tblGrid>
-      <w:tr>
-        <w:tc>
-          <w:tcPr>
-            <w:tcW w:type="dxa" w:w="2551"/>
-            <w:shd w:val="clear" w:color="auto" w:fill="E8E5F7"/>
-          </w:tcPr>
-          <w:p>
-            <w:r/>
-            <w:r>
-              <w:rPr>
-                <w:b/>
-                <w:sz w:val="18"/>
-              </w:rPr>
-              <w:t>Pantalla</w:t>
-            </w:r>
-          </w:p>
-        </w:tc>
-        <w:tc>
-          <w:tcPr>
-            <w:tcW w:type="dxa" w:w="3969"/>
-            <w:shd w:val="clear" w:color="auto" w:fill="E8E5F7"/>
-          </w:tcPr>
-          <w:p>
-            <w:r/>
-            <w:r>
-              <w:rPr>
-                <w:b/>
-                <w:sz w:val="18"/>
-              </w:rPr>
-              <w:t>Se abre desde</w:t>
-            </w:r>
-          </w:p>
-        </w:tc>
-        <w:tc>
-          <w:tcPr>
-            <w:tcW w:type="dxa" w:w="3118"/>
-            <w:shd w:val="clear" w:color="auto" w:fill="E8E5F7"/>
-          </w:tcPr>
-          <w:p>
-            <w:r/>
-            <w:r>
-              <w:rPr>
-                <w:b/>
-                <w:sz w:val="18"/>
-              </w:rPr>
-              <w:t>Pestañas que tiene</w:t>
-            </w:r>
-          </w:p>
-        </w:tc>
-      </w:tr>
-      <w:tr>
-        <w:tc>
-          <w:tcPr>
-            <w:tcW w:type="dxa" w:w="2551"/>
-          </w:tcPr>
-          <w:p>
-            <w:r/>
-            <w:r>
-              <w:rPr>
-                <w:sz w:val="18"/>
-              </w:rPr>
-              <w:t>Perfil (detalle)</w:t>
-            </w:r>
-          </w:p>
-        </w:tc>
-        <w:tc>
-          <w:tcPr>
-            <w:tcW w:type="dxa" w:w="3969"/>
-          </w:tcPr>
-          <w:p>
-            <w:r/>
-            <w:r>
-              <w:rPr>
-                <w:sz w:val="18"/>
-              </w:rPr>
-              <w:t>Sistema › Acceso › Perfil (detalle)</w:t>
-            </w:r>
-          </w:p>
-        </w:tc>
-        <w:tc>
-          <w:tcPr>
-            <w:tcW w:type="dxa" w:w="3118"/>
-          </w:tcPr>
-          <w:p>
-            <w:r/>
-            <w:r>
-              <w:rPr>
-                <w:sz w:val="18"/>
-              </w:rPr>
-              <w:t>—</w:t>
-            </w:r>
-          </w:p>
-        </w:tc>
-      </w:tr>
-      <w:tr>
-        <w:tc>
-          <w:tcPr>
-            <w:tcW w:type="dxa" w:w="2551"/>
-          </w:tcPr>
-          <w:p>
-            <w:r/>
-            <w:r>
-              <w:rPr>
-                <w:sz w:val="18"/>
-              </w:rPr>
-              <w:t>Cliente (detalle)</w:t>
-            </w:r>
-          </w:p>
-        </w:tc>
-        <w:tc>
-          <w:tcPr>
-            <w:tcW w:type="dxa" w:w="3969"/>
-          </w:tcPr>
-          <w:p>
-            <w:r/>
-            <w:r>
-              <w:rPr>
-                <w:sz w:val="18"/>
-              </w:rPr>
-              <w:t>Comercial › Cliente (detalle)</w:t>
-            </w:r>
-          </w:p>
-        </w:tc>
-        <w:tc>
-          <w:tcPr>
-            <w:tcW w:type="dxa" w:w="3118"/>
-          </w:tcPr>
-          <w:p>
-            <w:r/>
-            <w:r>
-              <w:rPr>
-                <w:sz w:val="18"/>
-              </w:rPr>
-              <w:t>—</w:t>
-            </w:r>
-          </w:p>
-        </w:tc>
-      </w:tr>
-      <w:tr>
-        <w:tc>
-          <w:tcPr>
-            <w:tcW w:type="dxa" w:w="2551"/>
-          </w:tcPr>
-          <w:p>
-            <w:r/>
-            <w:r>
-              <w:rPr>
-                <w:sz w:val="18"/>
-              </w:rPr>
-              <w:t>Nuevo usuario del cliente</w:t>
-            </w:r>
-          </w:p>
-        </w:tc>
-        <w:tc>
-          <w:tcPr>
-            <w:tcW w:type="dxa" w:w="3969"/>
-          </w:tcPr>
-          <w:p>
-            <w:r/>
-            <w:r>
-              <w:rPr>
-                <w:sz w:val="18"/>
-              </w:rPr>
-              <w:t>Cliente › Usuarios › Nuevo usuario del cliente</w:t>
-            </w:r>
-          </w:p>
-        </w:tc>
-        <w:tc>
-          <w:tcPr>
-            <w:tcW w:type="dxa" w:w="3118"/>
-          </w:tcPr>
-          <w:p>
-            <w:r/>
-            <w:r>
-              <w:rPr>
-                <w:sz w:val="18"/>
-              </w:rPr>
-              <w:t>—</w:t>
-            </w:r>
-          </w:p>
-        </w:tc>
-      </w:tr>
-      <w:tr>
-        <w:tc>
-          <w:tcPr>
-            <w:tcW w:type="dxa" w:w="2551"/>
-          </w:tcPr>
-          <w:p>
-            <w:r/>
-            <w:r>
-              <w:rPr>
-                <w:sz w:val="18"/>
-              </w:rPr>
-              <w:t>Planta (detalle)</w:t>
-            </w:r>
-          </w:p>
-        </w:tc>
-        <w:tc>
-          <w:tcPr>
-            <w:tcW w:type="dxa" w:w="3969"/>
-          </w:tcPr>
-          <w:p>
-            <w:r/>
-            <w:r>
-              <w:rPr>
-                <w:sz w:val="18"/>
-              </w:rPr>
-              <w:t>Cliente › Organización › Planta (detalle)</w:t>
-            </w:r>
-          </w:p>
-        </w:tc>
-        <w:tc>
-          <w:tcPr>
-            <w:tcW w:type="dxa" w:w="3118"/>
-          </w:tcPr>
-          <w:p>
-            <w:r/>
-            <w:r>
-              <w:rPr>
-                <w:sz w:val="18"/>
-              </w:rPr>
-              <w:t>—</w:t>
-            </w:r>
-          </w:p>
-        </w:tc>
-      </w:tr>
-      <w:tr>
-        <w:tc>
-          <w:tcPr>
-            <w:tcW w:type="dxa" w:w="2551"/>
-          </w:tcPr>
-          <w:p>
-            <w:r/>
-            <w:r>
-              <w:rPr>
-                <w:sz w:val="18"/>
-              </w:rPr>
-              <w:t>Área (detalle)</w:t>
-            </w:r>
-          </w:p>
-        </w:tc>
-        <w:tc>
-          <w:tcPr>
-            <w:tcW w:type="dxa" w:w="3969"/>
-          </w:tcPr>
-          <w:p>
-            <w:r/>
-            <w:r>
-              <w:rPr>
-                <w:sz w:val="18"/>
-              </w:rPr>
-              <w:t>Cliente › Organización › Área (detalle)</w:t>
-            </w:r>
-          </w:p>
-        </w:tc>
-        <w:tc>
-          <w:tcPr>
-            <w:tcW w:type="dxa" w:w="3118"/>
-          </w:tcPr>
-          <w:p>
-            <w:r/>
-            <w:r>
-              <w:rPr>
-                <w:sz w:val="18"/>
-              </w:rPr>
-              <w:t>—</w:t>
-            </w:r>
-          </w:p>
-        </w:tc>
-      </w:tr>
-      <w:tr>
-        <w:tc>
-          <w:tcPr>
-            <w:tcW w:type="dxa" w:w="2551"/>
-          </w:tcPr>
-          <w:p>
-            <w:r/>
-            <w:r>
-              <w:rPr>
-                <w:sz w:val="18"/>
-              </w:rPr>
-              <w:t>Especialidad de usuario (detalle)</w:t>
-            </w:r>
-          </w:p>
-        </w:tc>
-        <w:tc>
-          <w:tcPr>
-            <w:tcW w:type="dxa" w:w="3969"/>
-          </w:tcPr>
-          <w:p>
-            <w:r/>
-            <w:r>
-              <w:rPr>
-                <w:sz w:val="18"/>
-              </w:rPr>
-              <w:t>Cliente › Usuarios › Especialidad de usuario (detalle)</w:t>
-            </w:r>
-          </w:p>
-        </w:tc>
-        <w:tc>
-          <w:tcPr>
-            <w:tcW w:type="dxa" w:w="3118"/>
-          </w:tcPr>
-          <w:p>
-            <w:r/>
-            <w:r>
-              <w:rPr>
-                <w:sz w:val="18"/>
-              </w:rPr>
-              <w:t>—</w:t>
-            </w:r>
-          </w:p>
-        </w:tc>
-      </w:tr>
-      <w:tr>
-        <w:tc>
-          <w:tcPr>
-            <w:tcW w:type="dxa" w:w="2551"/>
-          </w:tcPr>
-          <w:p>
-            <w:r/>
-            <w:r>
-              <w:rPr>
-                <w:sz w:val="18"/>
-              </w:rPr>
-              <w:t>Grupo de trabajo (detalle)</w:t>
-            </w:r>
-          </w:p>
-        </w:tc>
-        <w:tc>
-          <w:tcPr>
-            <w:tcW w:type="dxa" w:w="3969"/>
-          </w:tcPr>
-          <w:p>
-            <w:r/>
-            <w:r>
-              <w:rPr>
-                <w:sz w:val="18"/>
-              </w:rPr>
-              <w:t>Cliente › Usuarios › Grupo de trabajo (detalle)</w:t>
-            </w:r>
-          </w:p>
-        </w:tc>
-        <w:tc>
-          <w:tcPr>
-            <w:tcW w:type="dxa" w:w="3118"/>
-          </w:tcPr>
-          <w:p>
-            <w:r/>
-            <w:r>
-              <w:rPr>
-                <w:sz w:val="18"/>
-              </w:rPr>
-              <w:t>Datos · Integrantes</w:t>
-            </w:r>
-          </w:p>
-        </w:tc>
-      </w:tr>
-      <w:tr>
-        <w:tc>
-          <w:tcPr>
-            <w:tcW w:type="dxa" w:w="2551"/>
-          </w:tcPr>
-          <w:p>
-            <w:r/>
-            <w:r>
-              <w:rPr>
-                <w:sz w:val="18"/>
-              </w:rPr>
-              <w:t>Centro de costo (detalle)</w:t>
-            </w:r>
-          </w:p>
-        </w:tc>
-        <w:tc>
-          <w:tcPr>
-            <w:tcW w:type="dxa" w:w="3969"/>
-          </w:tcPr>
-          <w:p>
-            <w:r/>
-            <w:r>
-              <w:rPr>
-                <w:sz w:val="18"/>
-              </w:rPr>
-              <w:t>Cliente › Organización › Centro de costo (detalle)</w:t>
-            </w:r>
-          </w:p>
-        </w:tc>
-        <w:tc>
-          <w:tcPr>
-            <w:tcW w:type="dxa" w:w="3118"/>
-          </w:tcPr>
-          <w:p>
-            <w:r/>
-            <w:r>
-              <w:rPr>
-                <w:sz w:val="18"/>
-              </w:rPr>
-              <w:t>—</w:t>
-            </w:r>
-          </w:p>
-        </w:tc>
-      </w:tr>
-    </w:tbl>
     <w:p>
       <w:pPr>
         <w:spacing w:after="40"/>
@@ -1430,6 +1125,36 @@
       </w:pPr>
       <w:r>
         <w:t>3. Operaciones, paso a paso</w:t>
+      </w:r>
+    </w:p>
+    <w:p>
+      <w:pPr/>
+      <w:r>
+        <w:rPr>
+          <w:b/>
+        </w:rPr>
+        <w:t>Aviso de la versión 2.0:</w:t>
+      </w:r>
+      <w:r>
+        <w:t xml:space="preserve"> los pasos de esta sección describen las operaciones del backlog. Las pantallas actuales y sus capturas están en </w:t>
+      </w:r>
+      <w:r>
+        <w:rPr>
+          <w:rFonts w:ascii="Consolas" w:hAnsi="Consolas"/>
+        </w:rPr>
+        <w:t>SIGMA_Flujo_Activos.docx (sección 3: «La estructura: plantas y áreas»)</w:t>
+      </w:r>
+      <w:r>
+        <w:t xml:space="preserve">; si hay diferencias, </w:t>
+      </w:r>
+      <w:r>
+        <w:rPr>
+          <w:b/>
+        </w:rPr>
+        <w:t>prevalece el manual de flujo</w:t>
+      </w:r>
+      <w:r>
+        <w:t>.</w:t>
       </w:r>
     </w:p>
     <w:p>

</xml_diff>